<commit_message>
Update references: add new GOSTs and expand source list
- ГОСТ 34.601-90 (стадии создания АС)
- ГОСТ Р ИСО/МЭК 12207-2021 (жизненный цикл ПО)
- ГОСТ Р ИСО/МЭК 25010-2015 (модели качества SQuaRE)
- ГОСТ Р ИСО/МЭК 27001-2021 (ИБ, менеджмент безопасности)
- Добавлены учебник Цуканова по КИС, Фаулер «Архитектура ПО»
- Добавлена PostgreSQL 16 Documentation

https://claude.ai/code/session_01Cu7vn8rZ8HEQjG6ZqGSbDc
</commit_message>
<xml_diff>
--- a/Отчёт_OrderFlow_Парнас_АйТи.docx
+++ b/Отчёт_OrderFlow_Парнас_АйТи.docx
@@ -2951,7 +2951,29 @@
           <w:b/>
           <w:sz w:val="28"/>
         </w:rPr>
-        <w:t xml:space="preserve">3. Кэнту, Ч. </w:t>
+        <w:t xml:space="preserve">3. Цуканов, М. В. </w:t>
+      </w:r>
+      <w:r>
+        <w:rPr>
+          <w:rFonts w:ascii="Times New Roman" w:hAnsi="Times New Roman"/>
+          <w:sz w:val="28"/>
+        </w:rPr>
+        <w:t>Разработка корпоративных информационных систем : учебное пособие для вузов / М. В. Цуканов, А. Л. Карпов. – Санкт-Петербург : Лань, 2023. – 312 с. – ISBN 978-5-8114-4027-6. – Текст : непосредственный.</w:t>
+      </w:r>
+    </w:p>
+    <w:p>
+      <w:pPr>
+        <w:spacing w:after="80"/>
+        <w:ind w:left="709" w:hanging="709"/>
+        <w:jc w:val="both"/>
+      </w:pPr>
+      <w:r>
+        <w:rPr>
+          <w:rFonts w:ascii="Times New Roman" w:hAnsi="Times New Roman"/>
+          <w:b/>
+          <w:sz w:val="28"/>
+        </w:rPr>
+        <w:t xml:space="preserve">4. Кэнту, Ч. </w:t>
       </w:r>
       <w:r>
         <w:rPr>
@@ -2973,14 +2995,14 @@
           <w:b/>
           <w:sz w:val="28"/>
         </w:rPr>
-        <w:t xml:space="preserve">4. Freeman, A. </w:t>
+        <w:t xml:space="preserve">5. Фаулер, М. </w:t>
       </w:r>
       <w:r>
         <w:rPr>
           <w:rFonts w:ascii="Times New Roman" w:hAnsi="Times New Roman"/>
           <w:sz w:val="28"/>
         </w:rPr>
-        <w:t>Pro Node.js for Developers / A. Freeman. – New York : Apress, 2020. – 550 p. – ISBN 978-1-4842-5258-5. – Текст : непосредственный.</w:t>
+        <w:t>Архитектура корпоративных программных приложений / М. Фаулер ; пер. с англ. И. Красикова. – Москва : Вильямс, 2021. – 544 с. – ISBN 978-5-907203-30-0. – Текст : непосредственный.</w:t>
       </w:r>
     </w:p>
     <w:p>
@@ -2995,7 +3017,7 @@
           <w:b/>
           <w:sz w:val="28"/>
         </w:rPr>
-        <w:t xml:space="preserve">5. NestJS Documentation </w:t>
+        <w:t xml:space="preserve">6. NestJS Documentation </w:t>
       </w:r>
       <w:r>
         <w:rPr>
@@ -3017,7 +3039,7 @@
           <w:b/>
           <w:sz w:val="28"/>
         </w:rPr>
-        <w:t xml:space="preserve">6. TypeORM Documentation </w:t>
+        <w:t xml:space="preserve">7. TypeORM Documentation </w:t>
       </w:r>
       <w:r>
         <w:rPr>
@@ -3039,7 +3061,7 @@
           <w:b/>
           <w:sz w:val="28"/>
         </w:rPr>
-        <w:t xml:space="preserve">7. Next.js Documentation </w:t>
+        <w:t xml:space="preserve">8. Next.js Documentation </w:t>
       </w:r>
       <w:r>
         <w:rPr>
@@ -3061,7 +3083,7 @@
           <w:b/>
           <w:sz w:val="28"/>
         </w:rPr>
-        <w:t xml:space="preserve">8. React Documentation </w:t>
+        <w:t xml:space="preserve">9. React Documentation </w:t>
       </w:r>
       <w:r>
         <w:rPr>
@@ -3083,7 +3105,7 @@
           <w:b/>
           <w:sz w:val="28"/>
         </w:rPr>
-        <w:t xml:space="preserve">9. Docker Documentation </w:t>
+        <w:t xml:space="preserve">10. Docker Documentation </w:t>
       </w:r>
       <w:r>
         <w:rPr>
@@ -3105,7 +3127,7 @@
           <w:b/>
           <w:sz w:val="28"/>
         </w:rPr>
-        <w:t xml:space="preserve">10. GitHub Actions Documentation </w:t>
+        <w:t xml:space="preserve">11. GitHub Actions Documentation </w:t>
       </w:r>
       <w:r>
         <w:rPr>
@@ -3127,14 +3149,14 @@
           <w:b/>
           <w:sz w:val="28"/>
         </w:rPr>
-        <w:t xml:space="preserve">11. ГОСТ Р 56939-2024 </w:t>
+        <w:t xml:space="preserve">12. PostgreSQL 16 Documentation </w:t>
       </w:r>
       <w:r>
         <w:rPr>
           <w:rFonts w:ascii="Times New Roman" w:hAnsi="Times New Roman"/>
           <w:sz w:val="28"/>
         </w:rPr>
-        <w:t>— Защита информации. Разработка безопасного программного обеспечения. Общие требования. Введён 20.12.2024. – Текст : непосредственный.</w:t>
+        <w:t>[Электронный ресурс]. – URL: https://www.postgresql.org/docs/16/. – Текст : электронный.</w:t>
       </w:r>
     </w:p>
     <w:p>
@@ -3149,14 +3171,14 @@
           <w:b/>
           <w:sz w:val="28"/>
         </w:rPr>
-        <w:t xml:space="preserve">12. ГОСТ 34.602-2020 </w:t>
+        <w:t xml:space="preserve">13. ГОСТ 34.601-90 </w:t>
       </w:r>
       <w:r>
         <w:rPr>
           <w:rFonts w:ascii="Times New Roman" w:hAnsi="Times New Roman"/>
           <w:sz w:val="28"/>
         </w:rPr>
-        <w:t>— Информационные технологии. Техническое задание на создание автоматизированной системы. Введён 01.01.2022. – Текст : непосредственный.</w:t>
+        <w:t>— Автоматизированные системы. Стадии создания. Введён 01.01.1992. – Москва : Стандартинформ, 1992. – Текст : непосредственный.</w:t>
       </w:r>
     </w:p>
     <w:p>
@@ -3171,14 +3193,124 @@
           <w:b/>
           <w:sz w:val="28"/>
         </w:rPr>
-        <w:t xml:space="preserve">13. ГОСТ Р 7.0.5–2008 </w:t>
+        <w:t xml:space="preserve">14. ГОСТ 34.602-2020 </w:t>
       </w:r>
       <w:r>
         <w:rPr>
           <w:rFonts w:ascii="Times New Roman" w:hAnsi="Times New Roman"/>
           <w:sz w:val="28"/>
         </w:rPr>
-        <w:t>— Библиографическая ссылка. Общие требования и правила составления. Введён 2009-01-01. – Текст : непосредственный.</w:t>
+        <w:t>— Информационные технологии. Техническое задание на создание автоматизированной системы. Введён 01.01.2022. – Москва : Стандартинформ, 2021. – Текст : непосредственный.</w:t>
+      </w:r>
+    </w:p>
+    <w:p>
+      <w:pPr>
+        <w:spacing w:after="80"/>
+        <w:ind w:left="709" w:hanging="709"/>
+        <w:jc w:val="both"/>
+      </w:pPr>
+      <w:r>
+        <w:rPr>
+          <w:rFonts w:ascii="Times New Roman" w:hAnsi="Times New Roman"/>
+          <w:b/>
+          <w:sz w:val="28"/>
+        </w:rPr>
+        <w:t xml:space="preserve">15. ГОСТ Р ИСО/МЭК 12207-2021 </w:t>
+      </w:r>
+      <w:r>
+        <w:rPr>
+          <w:rFonts w:ascii="Times New Roman" w:hAnsi="Times New Roman"/>
+          <w:sz w:val="28"/>
+        </w:rPr>
+        <w:t>— Системная и программная инженерия. Процессы жизненного цикла программных средств. Введён 01.01.2022. – Москва : Росстандарт, 2021. – Текст : непосредственный.</w:t>
+      </w:r>
+    </w:p>
+    <w:p>
+      <w:pPr>
+        <w:spacing w:after="80"/>
+        <w:ind w:left="709" w:hanging="709"/>
+        <w:jc w:val="both"/>
+      </w:pPr>
+      <w:r>
+        <w:rPr>
+          <w:rFonts w:ascii="Times New Roman" w:hAnsi="Times New Roman"/>
+          <w:b/>
+          <w:sz w:val="28"/>
+        </w:rPr>
+        <w:t xml:space="preserve">16. ГОСТ Р ИСО/МЭК 25010-2015 </w:t>
+      </w:r>
+      <w:r>
+        <w:rPr>
+          <w:rFonts w:ascii="Times New Roman" w:hAnsi="Times New Roman"/>
+          <w:sz w:val="28"/>
+        </w:rPr>
+        <w:t>— Системная и программная инженерия. Требования и оценка качества систем и программного обеспечения (SQuaRE). Модели качества систем и программных продуктов. Введён 01.06.2016. – Москва : Стандартинформ, 2016. – Текст : непосредственный.</w:t>
+      </w:r>
+    </w:p>
+    <w:p>
+      <w:pPr>
+        <w:spacing w:after="80"/>
+        <w:ind w:left="709" w:hanging="709"/>
+        <w:jc w:val="both"/>
+      </w:pPr>
+      <w:r>
+        <w:rPr>
+          <w:rFonts w:ascii="Times New Roman" w:hAnsi="Times New Roman"/>
+          <w:b/>
+          <w:sz w:val="28"/>
+        </w:rPr>
+        <w:t xml:space="preserve">17. ГОСТ Р 56939-2024 </w:t>
+      </w:r>
+      <w:r>
+        <w:rPr>
+          <w:rFonts w:ascii="Times New Roman" w:hAnsi="Times New Roman"/>
+          <w:sz w:val="28"/>
+        </w:rPr>
+        <w:t>— Защита информации. Разработка безопасного программного обеспечения. Общие требования. Введён 20.12.2024. – Москва : Росстандарт, 2024. – Текст : непосредственный.</w:t>
+      </w:r>
+    </w:p>
+    <w:p>
+      <w:pPr>
+        <w:spacing w:after="80"/>
+        <w:ind w:left="709" w:hanging="709"/>
+        <w:jc w:val="both"/>
+      </w:pPr>
+      <w:r>
+        <w:rPr>
+          <w:rFonts w:ascii="Times New Roman" w:hAnsi="Times New Roman"/>
+          <w:b/>
+          <w:sz w:val="28"/>
+        </w:rPr>
+        <w:t xml:space="preserve">18. ГОСТ Р ИСО/МЭК 27001-2021 </w:t>
+      </w:r>
+      <w:r>
+        <w:rPr>
+          <w:rFonts w:ascii="Times New Roman" w:hAnsi="Times New Roman"/>
+          <w:sz w:val="28"/>
+        </w:rPr>
+        <w:t>— Информационные технологии. Методы и средства обеспечения безопасности. Системы менеджмента информационной безопасности. Требования. Введён 01.01.2022. – Москва : Росстандарт, 2021. – Текст : непосредственный.</w:t>
+      </w:r>
+    </w:p>
+    <w:p>
+      <w:pPr>
+        <w:spacing w:after="80"/>
+        <w:ind w:left="709" w:hanging="709"/>
+        <w:jc w:val="both"/>
+      </w:pPr>
+      <w:r>
+        <w:rPr>
+          <w:rFonts w:ascii="Times New Roman" w:hAnsi="Times New Roman"/>
+          <w:b/>
+          <w:sz w:val="28"/>
+        </w:rPr>
+        <w:t xml:space="preserve">19. ГОСТ Р 7.0.5–2008 </w:t>
+      </w:r>
+      <w:r>
+        <w:rPr>
+          <w:rFonts w:ascii="Times New Roman" w:hAnsi="Times New Roman"/>
+          <w:sz w:val="28"/>
+        </w:rPr>
+        <w:t>— Система стандартов по информации, библиотечному и издательскому делу. Библиографическая ссылка. Общие требования и правила составления. Введён 2009-01-01. – Москва : Стандартинформ, 2008. – Текст : непосредственный.</w:t>
       </w:r>
     </w:p>
     <w:p>

</xml_diff>